<commit_message>
Fix clock times corrupted in translation; add post-fix evaluation
- indicTrans2.py: pad single-digit hours before translation ("8:03" ->
  "08:03", also Indian-script digits); IndicTransToolkit 1.1.1 otherwise
  turns them into "\1ः03", translated as "1:03"
- validation.py: read an explicit clock time from the translated sentence
  instead of trusting Qwen, which sometimes dropped or garbled it
- evaluation/run_postfix.py + results_postfix/: re-run on the same test set
  (time accuracy 83% -> 96%, exact match 52% -> 57%, not significant;
  optimistic because the fix followed error analysis on this set)
- Report: new Section 7.7 reporting the fix separately; README note

Co-Authored-By: Claude Opus 5.5 <noreply@anthropic.com>
</commit_message>
<xml_diff>
--- a/report/Team_TO-FILL_BCSE306_FinalReview.docx
+++ b/report/Team_TO-FILL_BCSE306_FinalReview.docx
@@ -921,7 +921,7 @@
       </w:pPr>
       <w:r>
         <w:rPr/>
-        <w:t>Older adults in India often manage several daily medicines, yet most reminder apps assume English text input. This project presents MedVoice, a voice-first web app that lets a user say a reminder in Hindi, Tamil, Telugu or Bengali and turns it into a scheduled notification. The request is translated to English with IndicTrans2, a 0.5-billion-parameter language model (Qwen2.5-0.5B-Instruct) extracts the medicine, dose, time and frequency, and a rule-based validation layer normalises the output and accepts it only if the scheduler can execute it; everything runs locally on an 8 GB laptop. On a new parallel test set of 100 requests (25 per language) with hand-written gold labels, the system produced a fully correct reminder for 52% of requests (95% CI [42, 62]), compared with 42% for a rule-based parser and 13% for the original zero-shot 1.5B pipeline, and every request returned a valid reminder or a clear error, with extraction taking 1.7 s on average. Ablations show that translation is essential (0% without it) and that the structured prompt and validation account for most of the gain over the original design. Error analysis traced the largest single error source to a time-formatting bug in the translation toolkit's preprocessing and to transliterated drug names, which point to clear next steps. The results fall short of the 70% target, so the system is a promising but not yet deployable prototype.</w:t>
+        <w:t>Older adults in India often manage several daily medicines, yet most reminder apps assume English text input. This project presents MedVoice, a voice-first web app that lets a user say a reminder in Hindi, Tamil, Telugu or Bengali and turns it into a scheduled notification. The request is translated to English with IndicTrans2, a 0.5-billion-parameter language model (Qwen2.5-0.5B-Instruct) extracts the medicine, dose, time and frequency, and a rule-based validation layer normalises the output and accepts it only if the scheduler can execute it; everything runs locally on an 8 GB laptop. On a new parallel test set of 100 requests (25 per language) with hand-written gold labels, the system produced a fully correct reminder for 52% of requests (95% CI [42, 62]), compared with 42% for a rule-based parser and 13% for the original zero-shot 1.5B pipeline, and every request returned a valid reminder or a clear error, with extraction taking 1.7 s on average. Ablations show that translation is essential (0% without it) and that the structured prompt and validation account for most of the gain over the original design. Error analysis traced the largest single error source to a time-formatting bug in the translation toolkit's preprocessing and to transliterated drug names; fixing the time bug afterwards raised accuracy to 57% on the same, already-seen test set. The results fall short of the 70% target, so the system is a promising but not yet deployable prototype.</w:t>
       </w:r>
     </w:p>
     <w:p>
@@ -12029,7 +12029,7 @@
       <w:r>
         <w:drawing>
           <wp:inline xmlns:a="http://schemas.openxmlformats.org/drawingml/2006/main" xmlns:pic="http://schemas.openxmlformats.org/drawingml/2006/picture">
-            <wp:extent cx="3566160" cy="4035392"/>
+            <wp:extent cx="3200400" cy="3621505"/>
             <wp:docPr id="1" name="Picture 1"/>
             <wp:cNvGraphicFramePr>
               <a:graphicFrameLocks noChangeAspect="1"/>
@@ -12050,7 +12050,7 @@
                   <pic:spPr>
                     <a:xfrm>
                       <a:off x="0" y="0"/>
-                      <a:ext cx="3566160" cy="4035392"/>
+                      <a:ext cx="3200400" cy="3621505"/>
                     </a:xfrm>
                     <a:prstGeom prst="rect"/>
                   </pic:spPr>
@@ -21891,7 +21891,7 @@
       <w:r>
         <w:drawing>
           <wp:inline xmlns:a="http://schemas.openxmlformats.org/drawingml/2006/main" xmlns:pic="http://schemas.openxmlformats.org/drawingml/2006/picture">
-            <wp:extent cx="5120640" cy="2346960"/>
+            <wp:extent cx="4572000" cy="2095500"/>
             <wp:docPr id="4" name="Picture 4"/>
             <wp:cNvGraphicFramePr>
               <a:graphicFrameLocks noChangeAspect="1"/>
@@ -21912,7 +21912,7 @@
                   <pic:spPr>
                     <a:xfrm>
                       <a:off x="0" y="0"/>
-                      <a:ext cx="5120640" cy="2346960"/>
+                      <a:ext cx="4572000" cy="2095500"/>
                     </a:xfrm>
                     <a:prstGeom prst="rect"/>
                   </pic:spPr>
@@ -21953,7 +21953,7 @@
       </w:pPr>
       <w:r>
         <w:rPr/>
-        <w:t>Latency: translation took 0.61 s and the 0.5B model 1.11 s on average, so extraction completes in 1.73 s (p95 1.97 s), well within the 5 s target. The 1.5B model took 10.1 s per request on the same 8 GB machine because it does not fit in memory alongside the translator and has to swap.</w:t>
+        <w:t>Extraction took 1.73 s on average (p95 1.97 s; translation 0.61 s + model 1.11 s), well within the 5 s target; the 1.5B model needed 10.1 s because it does not fit in 8 GB beside the translator.</w:t>
       </w:r>
     </w:p>
     <w:p>
@@ -22957,7 +22957,7 @@
       <w:r>
         <w:drawing>
           <wp:inline xmlns:a="http://schemas.openxmlformats.org/drawingml/2006/main" xmlns:pic="http://schemas.openxmlformats.org/drawingml/2006/picture">
-            <wp:extent cx="4937760" cy="2331720"/>
+            <wp:extent cx="4389120" cy="2072640"/>
             <wp:docPr id="5" name="Picture 5"/>
             <wp:cNvGraphicFramePr>
               <a:graphicFrameLocks noChangeAspect="1"/>
@@ -22978,7 +22978,7 @@
                   <pic:spPr>
                     <a:xfrm>
                       <a:off x="0" y="0"/>
-                      <a:ext cx="4937760" cy="2331720"/>
+                      <a:ext cx="4389120" cy="2072640"/>
                     </a:xfrm>
                     <a:prstGeom prst="rect"/>
                   </pic:spPr>
@@ -23008,58 +23008,44 @@
         <w:jc w:val="both"/>
       </w:pPr>
       <w:r>
+        <w:rPr>
+          <w:b/>
+        </w:rPr>
+        <w:t>Translation is essential:</w:t>
+      </w:r>
+      <w:r>
         <w:rPr/>
-        <w:t xml:space="preserve">Table 7.2 and Fig. 7.2 show that </w:t>
+        <w:t xml:space="preserve"> without it the model produced no correct reminder (0%), and translating from the wrong language — the original hard-coded Tamil setting — gave 17%, which justifies the language slider. </w:t>
       </w:r>
       <w:r>
         <w:rPr>
           <w:b/>
         </w:rPr>
-        <w:t>translation is essential</w:t>
+        <w:t>The format-defining system prompt</w:t>
       </w:r>
       <w:r>
         <w:rPr/>
-        <w:t xml:space="preserve">: given the Indian-language text directly, the same model produced no fully correct reminder (0%; -52 points, p &lt; 0.001). Translating from the wrong source language — the project's original hard-coded Tamil setting — cut accuracy to 17% (-35 points), which justifies the language slider. The </w:t>
+        <w:t xml:space="preserve"> comes next: the original plain prompt gave 13%, with 71% valid JSON and 23% correct times. </w:t>
       </w:r>
       <w:r>
         <w:rPr>
           <w:b/>
         </w:rPr>
-        <w:t>system prompt with defined formats</w:t>
+        <w:t>The rule-based frequency step</w:t>
       </w:r>
       <w:r>
         <w:rPr/>
-        <w:t xml:space="preserve"> is the next most important part: replacing it with the original plain prompt dropped accuracy to 13% (-39 points), with only 71% valid JSON and 23% correct times.</w:t>
-      </w:r>
-    </w:p>
-    <w:p>
-      <w:pPr>
-        <w:spacing w:after="120" w:line="360" w:lineRule="auto"/>
-        <w:jc w:val="both"/>
-      </w:pPr>
-      <w:r>
-        <w:rPr/>
-        <w:t xml:space="preserve">The </w:t>
+        <w:t xml:space="preserve"> added 12 points (p = 0.002); replacing the whole validation layer with the original one gave the same 40%, so the frequency rules carry the accuracy effect and the rest of validation carries the safety effect. Contrary to H2, </w:t>
       </w:r>
       <w:r>
         <w:rPr>
           <w:b/>
         </w:rPr>
-        <w:t>rule-based frequency step</w:t>
+        <w:t>the few-shot examples did not help</w:t>
       </w:r>
       <w:r>
         <w:rPr/>
-        <w:t xml:space="preserve"> added 12 points (40% without it, p = 0.002): on its own, Qwen wrote frequencies the scheduler could not use for 26% of requests. Replacing the whole validation layer with the original defaults-only validation gave the same 40%, showing that the frequency rules are the part of validation that changes accuracy; the rest (type checks, schedulability check, error messages) changes safety rather than accuracy. Contrary to hypothesis H2, the </w:t>
-      </w:r>
-      <w:r>
-        <w:rPr>
-          <w:b/>
-        </w:rPr>
-        <w:t>few-shot examples did not help</w:t>
-      </w:r>
-      <w:r>
-        <w:rPr/>
-        <w:t>: the system prompt alone scored 53% (+1 points, p = 1.000), and its dose accuracy was slightly lower (70% vs 76%). The format definitions, not the examples, carry the benefit.</w:t>
+        <w:t xml:space="preserve"> (53% without them, p = 1.000).</w:t>
       </w:r>
     </w:p>
     <w:p>
@@ -23075,7 +23061,7 @@
       </w:r>
       <w:r>
         <w:rPr/>
-        <w:t xml:space="preserve"> deleting 5% of characters from the input, a rough stand-in for speech-recognition errors, reduced accuracy from 52% to 35% (p &lt; 0.001); the rule-based baseline fell from 42% to 31%. Noise mostly damaged times and medicine names (64% and 61% correct).</w:t>
+        <w:t xml:space="preserve"> deleting 5% of input characters reduced accuracy to 35% (p &lt; 0.001) and the rule-based baseline to 31%, mainly through damaged times and medicine names.</w:t>
       </w:r>
     </w:p>
     <w:p>
@@ -23980,7 +23966,7 @@
       </w:r>
       <w:r>
         <w:rPr/>
-        <w:t xml:space="preserve"> Hindi #3 "शाम 7:30 बजे मेटफॉर्मिन की दो गोलियां…" → "…metformin at 1: 30 p.m." → 1:30 PM (expected 7:30 PM). IndicTransToolkit 1.1.1 rewrites "7:30" as the literal "\1ः30" (an unfilled regex back-reference; colon turned into a visarga), which the translator renders as "1". Two-digit hours (11:15) are protected and survive. A library bug, fixable by protecting times before translation.</w:t>
+        <w:t xml:space="preserve"> Hindi #3 "शाम 7:30 बजे मेटफॉर्मिन की दो गोलियां…" → "…metformin at 1: 30 p.m." → 1:30 PM (expected 7:30 PM). IndicTransToolkit 1.1.1 rewrites "7:30" as the literal "\1ः30" (an unfilled regex back-reference; colon turned into a visarga), which the translator renders as "1". Two-digit hours (11:15) are protected and survive. A library bug, fixed after the evaluation by padding the hour (Section 7.7).</w:t>
       </w:r>
     </w:p>
     <w:p>
@@ -24086,7 +24072,7 @@
       </w:r>
       <w:r>
         <w:rPr/>
-        <w:t xml:space="preserve"> The full pipeline produced a fully correct reminder for 52% of requests (95% CI [42, 62]). It is significantly better than the original pipeline (13%, Holm-adjusted p &lt; 0.001), but its advantage over the rule-based parser (42%) is not statistically significant on 100 items (p = 0.220). H1 is therefore only partly supported, and the 70% target (O1) was not met.</w:t>
+        <w:t xml:space="preserve"> 52% fully correct (95% CI [42, 62]): significantly better than the original pipeline (13%, Holm-adjusted p &lt; 0.001) but not than the rule-based parser (42%, p = 0.220). H1 is partly supported; the 70% target was not met.</w:t>
       </w:r>
     </w:p>
     <w:p>
@@ -24102,7 +24088,7 @@
       </w:r>
       <w:r>
         <w:rPr/>
-        <w:t xml:space="preserve"> Translation is the most important component (-52 points without it), followed by the format-defining system prompt (-39 points with the plain prompt) and the rule-based frequency step (-12 points). The few-shot examples made no measurable difference (+1 points, p = 1.000). H2 is supported for translation and rejected for the few-shot examples.</w:t>
+        <w:t xml:space="preserve"> Translation matters most (-52 points without it), then the format-defining prompt (-39) and the frequency rules (-12); the few-shot examples made no difference (+1). H2 holds for translation, not for the examples.</w:t>
       </w:r>
     </w:p>
     <w:p>
@@ -24118,7 +24104,7 @@
       </w:r>
       <w:r>
         <w:rPr/>
-        <w:t xml:space="preserve"> Accuracy was 52% in every language (χ² p = 1.00), so H3 is supported, but all languages are below the 60% target of O2. Speech-like noise cost 17 points and the wrong source language 35 points.</w:t>
+        <w:t xml:space="preserve"> Accuracy was equal across languages (χ² p = 1.00), supporting H3, but below the 60% target of O2; noise cost 17 points and the wrong source language 35.</w:t>
       </w:r>
     </w:p>
     <w:p>
@@ -24134,7 +24120,7 @@
       </w:r>
       <w:r>
         <w:rPr/>
-        <w:t xml:space="preserve"> The 0.5B model was 9 points less accurate than 1.5B with the same prompt (52% vs 61%, p = 0.035) but 9× faster on the 8 GB laptop (1.11 s vs 10.06 s). H4 is supported, but the 1.5B model also eliminated invented doses (0% vs 39%), so on hardware with enough memory it would be the safer choice.</w:t>
+        <w:t xml:space="preserve"> 0.5B was 9 points below 1.5B (52% vs 61%, p = 0.035) but 9× faster, supporting H4; 1.5B also invented no doses (0% vs 39%), so it is the safer choice where memory allows.</w:t>
       </w:r>
     </w:p>
     <w:p>
@@ -24193,6 +24179,770 @@
       <w:r>
         <w:rPr/>
         <w:t xml:space="preserve"> Exact match treats a misspelt drug like a wrong drug and ignores error severity. No user study, task-completion test or System Usability Scale was run, so usability and effect on adherence are not shown — the main gap against Track F's requirements.</w:t>
+      </w:r>
+    </w:p>
+    <w:p>
+      <w:pPr>
+        <w:pStyle w:val="Heading2"/>
+        <w:keepNext/>
+        <w:spacing w:after="100"/>
+        <w:jc w:val="left"/>
+      </w:pPr>
+      <w:r>
+        <w:rPr/>
+        <w:t>7.7 Post-Evaluation Fix (reported separately)</w:t>
+      </w:r>
+    </w:p>
+    <w:p>
+      <w:pPr>
+        <w:spacing w:after="120" w:line="360" w:lineRule="auto"/>
+        <w:jc w:val="both"/>
+      </w:pPr>
+      <w:r>
+        <w:rPr/>
+        <w:t>After the evaluation, the largest error source from Section 7.4 was addressed: (1) indicTrans2.py pads single-digit hours before translation ("8:03" → "08:03", also for Indian-script digits), which IndicTransToolkit then protects correctly; (2) validation.py reads an explicit clock time from the translated sentence instead of trusting the model. Translation and Qwen-0.5B were re-run on the same 100 items, all else unchanged (evaluation/run_postfix.py).</w:t>
+      </w:r>
+    </w:p>
+    <w:p>
+      <w:pPr>
+        <w:keepNext/>
+        <w:spacing w:after="60"/>
+        <w:jc w:val="left"/>
+      </w:pPr>
+      <w:r>
+        <w:rPr>
+          <w:i/>
+          <w:sz w:val="20"/>
+        </w:rPr>
+        <w:t>Table 7.4: Post-evaluation fix on the same test set (not a held-out result)</w:t>
+      </w:r>
+    </w:p>
+    <w:tbl>
+      <w:tblPr>
+        <w:tblW w:w="9026" w:type="dxa"/>
+        <w:tblBorders>
+          <w:top w:val="single" w:sz="4" w:space="0" w:color="auto"/>
+          <w:left w:val="single" w:sz="4" w:space="0" w:color="auto"/>
+          <w:bottom w:val="single" w:sz="4" w:space="0" w:color="auto"/>
+          <w:right w:val="single" w:sz="4" w:space="0" w:color="auto"/>
+          <w:insideH w:val="single" w:sz="4" w:space="0" w:color="auto"/>
+          <w:insideV w:val="single" w:sz="4" w:space="0" w:color="auto"/>
+        </w:tblBorders>
+        <w:tblCellMar>
+          <w:left w:w="10" w:type="dxa"/>
+          <w:right w:w="10" w:type="dxa"/>
+        </w:tblCellMar>
+        <w:tblLook w:val="04A0" w:firstRow="1" w:lastRow="0" w:firstColumn="1" w:lastColumn="0" w:noHBand="0" w:noVBand="1"/>
+      </w:tblPr>
+      <w:tblGrid>
+        <w:gridCol w:w="3300"/>
+        <w:gridCol w:w="1600"/>
+        <w:gridCol w:w="2626"/>
+        <w:gridCol w:w="1500"/>
+      </w:tblGrid>
+      <w:tr>
+        <w:tblPrEx>
+          <w:tblCellMar>
+            <w:top w:w="0" w:type="dxa"/>
+            <w:bottom w:w="0" w:type="dxa"/>
+          </w:tblCellMar>
+        </w:tblPrEx>
+        <w:trPr>
+          <w:cantSplit/>
+          <w:tblHeader/>
+        </w:trPr>
+        <w:tc>
+          <w:tcPr>
+            <w:tcW w:w="3300" w:type="dxa"/>
+            <w:tcBorders>
+              <w:top w:val="single" w:sz="4" w:space="0" w:color="A6A6A6"/>
+              <w:left w:val="single" w:sz="4" w:space="0" w:color="A6A6A6"/>
+              <w:bottom w:val="single" w:sz="4" w:space="0" w:color="A6A6A6"/>
+              <w:right w:val="single" w:sz="4" w:space="0" w:color="A6A6A6"/>
+            </w:tcBorders>
+            <w:shd w:val="clear" w:color="auto" w:fill="1F3864"/>
+            <w:tcMar>
+              <w:top w:w="60" w:type="dxa"/>
+              <w:left w:w="90" w:type="dxa"/>
+              <w:bottom w:w="60" w:type="dxa"/>
+              <w:right w:w="90" w:type="dxa"/>
+            </w:tcMar>
+            <w:vAlign w:val="center"/>
+          </w:tcPr>
+          <w:p>
+            <w:pPr>
+              <w:keepNext/>
+              <w:spacing w:after="30"/>
+              <w:jc w:val="center"/>
+            </w:pPr>
+            <w:r>
+              <w:rPr>
+                <w:b/>
+                <w:color w:val="FFFFFF"/>
+                <w:sz w:val="20"/>
+              </w:rPr>
+              <w:t>Configuration (Qwen-0.5B unless stated)</w:t>
+            </w:r>
+          </w:p>
+        </w:tc>
+        <w:tc>
+          <w:tcPr>
+            <w:tcW w:w="1600" w:type="dxa"/>
+            <w:tcBorders>
+              <w:top w:val="single" w:sz="4" w:space="0" w:color="A6A6A6"/>
+              <w:left w:val="single" w:sz="4" w:space="0" w:color="A6A6A6"/>
+              <w:bottom w:val="single" w:sz="4" w:space="0" w:color="A6A6A6"/>
+              <w:right w:val="single" w:sz="4" w:space="0" w:color="A6A6A6"/>
+            </w:tcBorders>
+            <w:shd w:val="clear" w:color="auto" w:fill="1F3864"/>
+            <w:tcMar>
+              <w:top w:w="60" w:type="dxa"/>
+              <w:left w:w="90" w:type="dxa"/>
+              <w:bottom w:w="60" w:type="dxa"/>
+              <w:right w:w="90" w:type="dxa"/>
+            </w:tcMar>
+            <w:vAlign w:val="center"/>
+          </w:tcPr>
+          <w:p>
+            <w:pPr>
+              <w:keepNext/>
+              <w:spacing w:after="30"/>
+              <w:jc w:val="center"/>
+            </w:pPr>
+            <w:r>
+              <w:rPr>
+                <w:b/>
+                <w:color w:val="FFFFFF"/>
+                <w:sz w:val="20"/>
+              </w:rPr>
+              <w:t>Exact match (95% CI)</w:t>
+            </w:r>
+          </w:p>
+        </w:tc>
+        <w:tc>
+          <w:tcPr>
+            <w:tcW w:w="2626" w:type="dxa"/>
+            <w:tcBorders>
+              <w:top w:val="single" w:sz="4" w:space="0" w:color="A6A6A6"/>
+              <w:left w:val="single" w:sz="4" w:space="0" w:color="A6A6A6"/>
+              <w:bottom w:val="single" w:sz="4" w:space="0" w:color="A6A6A6"/>
+              <w:right w:val="single" w:sz="4" w:space="0" w:color="A6A6A6"/>
+            </w:tcBorders>
+            <w:shd w:val="clear" w:color="auto" w:fill="1F3864"/>
+            <w:tcMar>
+              <w:top w:w="60" w:type="dxa"/>
+              <w:left w:w="90" w:type="dxa"/>
+              <w:bottom w:w="60" w:type="dxa"/>
+              <w:right w:w="90" w:type="dxa"/>
+            </w:tcMar>
+            <w:vAlign w:val="center"/>
+          </w:tcPr>
+          <w:p>
+            <w:pPr>
+              <w:keepNext/>
+              <w:spacing w:after="30"/>
+              <w:jc w:val="center"/>
+            </w:pPr>
+            <w:r>
+              <w:rPr>
+                <w:b/>
+                <w:color w:val="FFFFFF"/>
+                <w:sz w:val="20"/>
+              </w:rPr>
+              <w:t>Medicine / dose / time / frequency</w:t>
+            </w:r>
+          </w:p>
+        </w:tc>
+        <w:tc>
+          <w:tcPr>
+            <w:tcW w:w="1500" w:type="dxa"/>
+            <w:tcBorders>
+              <w:top w:val="single" w:sz="4" w:space="0" w:color="A6A6A6"/>
+              <w:left w:val="single" w:sz="4" w:space="0" w:color="A6A6A6"/>
+              <w:bottom w:val="single" w:sz="4" w:space="0" w:color="A6A6A6"/>
+              <w:right w:val="single" w:sz="4" w:space="0" w:color="A6A6A6"/>
+            </w:tcBorders>
+            <w:shd w:val="clear" w:color="auto" w:fill="1F3864"/>
+            <w:tcMar>
+              <w:top w:w="60" w:type="dxa"/>
+              <w:left w:w="90" w:type="dxa"/>
+              <w:bottom w:w="60" w:type="dxa"/>
+              <w:right w:w="90" w:type="dxa"/>
+            </w:tcMar>
+            <w:vAlign w:val="center"/>
+          </w:tcPr>
+          <w:p>
+            <w:pPr>
+              <w:keepNext/>
+              <w:spacing w:after="30"/>
+              <w:jc w:val="center"/>
+            </w:pPr>
+            <w:r>
+              <w:rPr>
+                <w:b/>
+                <w:color w:val="FFFFFF"/>
+                <w:sz w:val="20"/>
+              </w:rPr>
+              <w:t>Schedulable</w:t>
+            </w:r>
+          </w:p>
+        </w:tc>
+      </w:tr>
+      <w:tr>
+        <w:tblPrEx>
+          <w:tblCellMar>
+            <w:top w:w="0" w:type="dxa"/>
+            <w:bottom w:w="0" w:type="dxa"/>
+          </w:tblCellMar>
+        </w:tblPrEx>
+        <w:trPr>
+          <w:cantSplit/>
+        </w:trPr>
+        <w:tc>
+          <w:tcPr>
+            <w:tcW w:w="3300" w:type="dxa"/>
+            <w:tcBorders>
+              <w:top w:val="single" w:sz="4" w:space="0" w:color="A6A6A6"/>
+              <w:left w:val="single" w:sz="4" w:space="0" w:color="A6A6A6"/>
+              <w:bottom w:val="single" w:sz="4" w:space="0" w:color="A6A6A6"/>
+              <w:right w:val="single" w:sz="4" w:space="0" w:color="A6A6A6"/>
+            </w:tcBorders>
+            <w:tcMar>
+              <w:top w:w="60" w:type="dxa"/>
+              <w:left w:w="90" w:type="dxa"/>
+              <w:bottom w:w="60" w:type="dxa"/>
+              <w:right w:w="90" w:type="dxa"/>
+            </w:tcMar>
+            <w:vAlign w:val="center"/>
+          </w:tcPr>
+          <w:p>
+            <w:pPr>
+              <w:spacing w:after="30"/>
+              <w:jc w:val="left"/>
+            </w:pPr>
+            <w:r>
+              <w:rPr>
+                <w:sz w:val="20"/>
+              </w:rPr>
+              <w:t>Original system (Section 7.1, before the fix)</w:t>
+            </w:r>
+          </w:p>
+        </w:tc>
+        <w:tc>
+          <w:tcPr>
+            <w:tcW w:w="1600" w:type="dxa"/>
+            <w:tcBorders>
+              <w:top w:val="single" w:sz="4" w:space="0" w:color="A6A6A6"/>
+              <w:left w:val="single" w:sz="4" w:space="0" w:color="A6A6A6"/>
+              <w:bottom w:val="single" w:sz="4" w:space="0" w:color="A6A6A6"/>
+              <w:right w:val="single" w:sz="4" w:space="0" w:color="A6A6A6"/>
+            </w:tcBorders>
+            <w:tcMar>
+              <w:top w:w="60" w:type="dxa"/>
+              <w:left w:w="90" w:type="dxa"/>
+              <w:bottom w:w="60" w:type="dxa"/>
+              <w:right w:w="90" w:type="dxa"/>
+            </w:tcMar>
+            <w:vAlign w:val="center"/>
+          </w:tcPr>
+          <w:p>
+            <w:pPr>
+              <w:spacing w:after="30"/>
+              <w:jc w:val="left"/>
+            </w:pPr>
+            <w:r>
+              <w:rPr>
+                <w:sz w:val="20"/>
+              </w:rPr>
+              <w:t>52% [42, 62]</w:t>
+            </w:r>
+          </w:p>
+        </w:tc>
+        <w:tc>
+          <w:tcPr>
+            <w:tcW w:w="2626" w:type="dxa"/>
+            <w:tcBorders>
+              <w:top w:val="single" w:sz="4" w:space="0" w:color="A6A6A6"/>
+              <w:left w:val="single" w:sz="4" w:space="0" w:color="A6A6A6"/>
+              <w:bottom w:val="single" w:sz="4" w:space="0" w:color="A6A6A6"/>
+              <w:right w:val="single" w:sz="4" w:space="0" w:color="A6A6A6"/>
+            </w:tcBorders>
+            <w:tcMar>
+              <w:top w:w="60" w:type="dxa"/>
+              <w:left w:w="90" w:type="dxa"/>
+              <w:bottom w:w="60" w:type="dxa"/>
+              <w:right w:w="90" w:type="dxa"/>
+            </w:tcMar>
+            <w:vAlign w:val="center"/>
+          </w:tcPr>
+          <w:p>
+            <w:pPr>
+              <w:spacing w:after="30"/>
+              <w:jc w:val="left"/>
+            </w:pPr>
+            <w:r>
+              <w:rPr>
+                <w:sz w:val="20"/>
+              </w:rPr>
+              <w:t>74% / 76% / 83% / 100%</w:t>
+            </w:r>
+          </w:p>
+        </w:tc>
+        <w:tc>
+          <w:tcPr>
+            <w:tcW w:w="1500" w:type="dxa"/>
+            <w:tcBorders>
+              <w:top w:val="single" w:sz="4" w:space="0" w:color="A6A6A6"/>
+              <w:left w:val="single" w:sz="4" w:space="0" w:color="A6A6A6"/>
+              <w:bottom w:val="single" w:sz="4" w:space="0" w:color="A6A6A6"/>
+              <w:right w:val="single" w:sz="4" w:space="0" w:color="A6A6A6"/>
+            </w:tcBorders>
+            <w:tcMar>
+              <w:top w:w="60" w:type="dxa"/>
+              <w:left w:w="90" w:type="dxa"/>
+              <w:bottom w:w="60" w:type="dxa"/>
+              <w:right w:w="90" w:type="dxa"/>
+            </w:tcMar>
+            <w:vAlign w:val="center"/>
+          </w:tcPr>
+          <w:p>
+            <w:pPr>
+              <w:spacing w:after="30"/>
+              <w:jc w:val="left"/>
+            </w:pPr>
+            <w:r>
+              <w:rPr>
+                <w:sz w:val="20"/>
+              </w:rPr>
+              <w:t>100%</w:t>
+            </w:r>
+          </w:p>
+        </w:tc>
+      </w:tr>
+      <w:tr>
+        <w:tblPrEx>
+          <w:tblCellMar>
+            <w:top w:w="0" w:type="dxa"/>
+            <w:bottom w:w="0" w:type="dxa"/>
+          </w:tblCellMar>
+        </w:tblPrEx>
+        <w:trPr>
+          <w:cantSplit/>
+        </w:trPr>
+        <w:tc>
+          <w:tcPr>
+            <w:tcW w:w="3300" w:type="dxa"/>
+            <w:tcBorders>
+              <w:top w:val="single" w:sz="4" w:space="0" w:color="A6A6A6"/>
+              <w:left w:val="single" w:sz="4" w:space="0" w:color="A6A6A6"/>
+              <w:bottom w:val="single" w:sz="4" w:space="0" w:color="A6A6A6"/>
+              <w:right w:val="single" w:sz="4" w:space="0" w:color="A6A6A6"/>
+            </w:tcBorders>
+            <w:tcMar>
+              <w:top w:w="60" w:type="dxa"/>
+              <w:left w:w="90" w:type="dxa"/>
+              <w:bottom w:w="60" w:type="dxa"/>
+              <w:right w:w="90" w:type="dxa"/>
+            </w:tcMar>
+            <w:vAlign w:val="center"/>
+          </w:tcPr>
+          <w:p>
+            <w:pPr>
+              <w:spacing w:after="30"/>
+              <w:jc w:val="left"/>
+            </w:pPr>
+            <w:r>
+              <w:rPr>
+                <w:sz w:val="20"/>
+              </w:rPr>
+              <w:t>+ time-safe translation</w:t>
+            </w:r>
+          </w:p>
+        </w:tc>
+        <w:tc>
+          <w:tcPr>
+            <w:tcW w:w="1600" w:type="dxa"/>
+            <w:tcBorders>
+              <w:top w:val="single" w:sz="4" w:space="0" w:color="A6A6A6"/>
+              <w:left w:val="single" w:sz="4" w:space="0" w:color="A6A6A6"/>
+              <w:bottom w:val="single" w:sz="4" w:space="0" w:color="A6A6A6"/>
+              <w:right w:val="single" w:sz="4" w:space="0" w:color="A6A6A6"/>
+            </w:tcBorders>
+            <w:tcMar>
+              <w:top w:w="60" w:type="dxa"/>
+              <w:left w:w="90" w:type="dxa"/>
+              <w:bottom w:w="60" w:type="dxa"/>
+              <w:right w:w="90" w:type="dxa"/>
+            </w:tcMar>
+            <w:vAlign w:val="center"/>
+          </w:tcPr>
+          <w:p>
+            <w:pPr>
+              <w:spacing w:after="30"/>
+              <w:jc w:val="left"/>
+            </w:pPr>
+            <w:r>
+              <w:rPr>
+                <w:sz w:val="20"/>
+              </w:rPr>
+              <w:t>57% [47, 67]</w:t>
+            </w:r>
+          </w:p>
+        </w:tc>
+        <w:tc>
+          <w:tcPr>
+            <w:tcW w:w="2626" w:type="dxa"/>
+            <w:tcBorders>
+              <w:top w:val="single" w:sz="4" w:space="0" w:color="A6A6A6"/>
+              <w:left w:val="single" w:sz="4" w:space="0" w:color="A6A6A6"/>
+              <w:bottom w:val="single" w:sz="4" w:space="0" w:color="A6A6A6"/>
+              <w:right w:val="single" w:sz="4" w:space="0" w:color="A6A6A6"/>
+            </w:tcBorders>
+            <w:tcMar>
+              <w:top w:w="60" w:type="dxa"/>
+              <w:left w:w="90" w:type="dxa"/>
+              <w:bottom w:w="60" w:type="dxa"/>
+              <w:right w:w="90" w:type="dxa"/>
+            </w:tcMar>
+            <w:vAlign w:val="center"/>
+          </w:tcPr>
+          <w:p>
+            <w:pPr>
+              <w:spacing w:after="30"/>
+              <w:jc w:val="left"/>
+            </w:pPr>
+            <w:r>
+              <w:rPr>
+                <w:sz w:val="20"/>
+              </w:rPr>
+              <w:t>74% / 76% / 93% / 100%</w:t>
+            </w:r>
+          </w:p>
+        </w:tc>
+        <w:tc>
+          <w:tcPr>
+            <w:tcW w:w="1500" w:type="dxa"/>
+            <w:tcBorders>
+              <w:top w:val="single" w:sz="4" w:space="0" w:color="A6A6A6"/>
+              <w:left w:val="single" w:sz="4" w:space="0" w:color="A6A6A6"/>
+              <w:bottom w:val="single" w:sz="4" w:space="0" w:color="A6A6A6"/>
+              <w:right w:val="single" w:sz="4" w:space="0" w:color="A6A6A6"/>
+            </w:tcBorders>
+            <w:tcMar>
+              <w:top w:w="60" w:type="dxa"/>
+              <w:left w:w="90" w:type="dxa"/>
+              <w:bottom w:w="60" w:type="dxa"/>
+              <w:right w:w="90" w:type="dxa"/>
+            </w:tcMar>
+            <w:vAlign w:val="center"/>
+          </w:tcPr>
+          <w:p>
+            <w:pPr>
+              <w:spacing w:after="30"/>
+              <w:jc w:val="left"/>
+            </w:pPr>
+            <w:r>
+              <w:rPr>
+                <w:sz w:val="20"/>
+              </w:rPr>
+              <w:t>98%</w:t>
+            </w:r>
+          </w:p>
+        </w:tc>
+      </w:tr>
+      <w:tr>
+        <w:tblPrEx>
+          <w:tblCellMar>
+            <w:top w:w="0" w:type="dxa"/>
+            <w:bottom w:w="0" w:type="dxa"/>
+          </w:tblCellMar>
+        </w:tblPrEx>
+        <w:trPr>
+          <w:cantSplit/>
+        </w:trPr>
+        <w:tc>
+          <w:tcPr>
+            <w:tcW w:w="3300" w:type="dxa"/>
+            <w:tcBorders>
+              <w:top w:val="single" w:sz="4" w:space="0" w:color="A6A6A6"/>
+              <w:left w:val="single" w:sz="4" w:space="0" w:color="A6A6A6"/>
+              <w:bottom w:val="single" w:sz="4" w:space="0" w:color="A6A6A6"/>
+              <w:right w:val="single" w:sz="4" w:space="0" w:color="A6A6A6"/>
+            </w:tcBorders>
+            <w:tcMar>
+              <w:top w:w="60" w:type="dxa"/>
+              <w:left w:w="90" w:type="dxa"/>
+              <w:bottom w:w="60" w:type="dxa"/>
+              <w:right w:w="90" w:type="dxa"/>
+            </w:tcMar>
+            <w:vAlign w:val="center"/>
+          </w:tcPr>
+          <w:p>
+            <w:pPr>
+              <w:spacing w:after="30"/>
+              <w:jc w:val="left"/>
+            </w:pPr>
+            <w:r>
+              <w:rPr>
+                <w:sz w:val="20"/>
+              </w:rPr>
+              <w:t>+ time-safe translation + sentence time rule (current system)</w:t>
+            </w:r>
+          </w:p>
+        </w:tc>
+        <w:tc>
+          <w:tcPr>
+            <w:tcW w:w="1600" w:type="dxa"/>
+            <w:tcBorders>
+              <w:top w:val="single" w:sz="4" w:space="0" w:color="A6A6A6"/>
+              <w:left w:val="single" w:sz="4" w:space="0" w:color="A6A6A6"/>
+              <w:bottom w:val="single" w:sz="4" w:space="0" w:color="A6A6A6"/>
+              <w:right w:val="single" w:sz="4" w:space="0" w:color="A6A6A6"/>
+            </w:tcBorders>
+            <w:tcMar>
+              <w:top w:w="60" w:type="dxa"/>
+              <w:left w:w="90" w:type="dxa"/>
+              <w:bottom w:w="60" w:type="dxa"/>
+              <w:right w:w="90" w:type="dxa"/>
+            </w:tcMar>
+            <w:vAlign w:val="center"/>
+          </w:tcPr>
+          <w:p>
+            <w:pPr>
+              <w:spacing w:after="30"/>
+              <w:jc w:val="left"/>
+            </w:pPr>
+            <w:r>
+              <w:rPr>
+                <w:sz w:val="20"/>
+              </w:rPr>
+              <w:t>57% [47, 67]</w:t>
+            </w:r>
+          </w:p>
+        </w:tc>
+        <w:tc>
+          <w:tcPr>
+            <w:tcW w:w="2626" w:type="dxa"/>
+            <w:tcBorders>
+              <w:top w:val="single" w:sz="4" w:space="0" w:color="A6A6A6"/>
+              <w:left w:val="single" w:sz="4" w:space="0" w:color="A6A6A6"/>
+              <w:bottom w:val="single" w:sz="4" w:space="0" w:color="A6A6A6"/>
+              <w:right w:val="single" w:sz="4" w:space="0" w:color="A6A6A6"/>
+            </w:tcBorders>
+            <w:tcMar>
+              <w:top w:w="60" w:type="dxa"/>
+              <w:left w:w="90" w:type="dxa"/>
+              <w:bottom w:w="60" w:type="dxa"/>
+              <w:right w:w="90" w:type="dxa"/>
+            </w:tcMar>
+            <w:vAlign w:val="center"/>
+          </w:tcPr>
+          <w:p>
+            <w:pPr>
+              <w:spacing w:after="30"/>
+              <w:jc w:val="left"/>
+            </w:pPr>
+            <w:r>
+              <w:rPr>
+                <w:sz w:val="20"/>
+              </w:rPr>
+              <w:t>74% / 76% / 96% / 100%</w:t>
+            </w:r>
+          </w:p>
+        </w:tc>
+        <w:tc>
+          <w:tcPr>
+            <w:tcW w:w="1500" w:type="dxa"/>
+            <w:tcBorders>
+              <w:top w:val="single" w:sz="4" w:space="0" w:color="A6A6A6"/>
+              <w:left w:val="single" w:sz="4" w:space="0" w:color="A6A6A6"/>
+              <w:bottom w:val="single" w:sz="4" w:space="0" w:color="A6A6A6"/>
+              <w:right w:val="single" w:sz="4" w:space="0" w:color="A6A6A6"/>
+            </w:tcBorders>
+            <w:tcMar>
+              <w:top w:w="60" w:type="dxa"/>
+              <w:left w:w="90" w:type="dxa"/>
+              <w:bottom w:w="60" w:type="dxa"/>
+              <w:right w:w="90" w:type="dxa"/>
+            </w:tcMar>
+            <w:vAlign w:val="center"/>
+          </w:tcPr>
+          <w:p>
+            <w:pPr>
+              <w:spacing w:after="30"/>
+              <w:jc w:val="left"/>
+            </w:pPr>
+            <w:r>
+              <w:rPr>
+                <w:sz w:val="20"/>
+              </w:rPr>
+              <w:t>100%</w:t>
+            </w:r>
+          </w:p>
+        </w:tc>
+      </w:tr>
+      <w:tr>
+        <w:tblPrEx>
+          <w:tblCellMar>
+            <w:top w:w="0" w:type="dxa"/>
+            <w:bottom w:w="0" w:type="dxa"/>
+          </w:tblCellMar>
+        </w:tblPrEx>
+        <w:trPr>
+          <w:cantSplit/>
+        </w:trPr>
+        <w:tc>
+          <w:tcPr>
+            <w:tcW w:w="3300" w:type="dxa"/>
+            <w:tcBorders>
+              <w:top w:val="single" w:sz="4" w:space="0" w:color="A6A6A6"/>
+              <w:left w:val="single" w:sz="4" w:space="0" w:color="A6A6A6"/>
+              <w:bottom w:val="single" w:sz="4" w:space="0" w:color="A6A6A6"/>
+              <w:right w:val="single" w:sz="4" w:space="0" w:color="A6A6A6"/>
+            </w:tcBorders>
+            <w:tcMar>
+              <w:top w:w="60" w:type="dxa"/>
+              <w:left w:w="90" w:type="dxa"/>
+              <w:bottom w:w="60" w:type="dxa"/>
+              <w:right w:w="90" w:type="dxa"/>
+            </w:tcMar>
+            <w:vAlign w:val="center"/>
+          </w:tcPr>
+          <w:p>
+            <w:pPr>
+              <w:spacing w:after="30"/>
+              <w:jc w:val="left"/>
+            </w:pPr>
+            <w:r>
+              <w:rPr>
+                <w:sz w:val="20"/>
+              </w:rPr>
+              <w:t>B1 rule-based with time-safe translation</w:t>
+            </w:r>
+          </w:p>
+        </w:tc>
+        <w:tc>
+          <w:tcPr>
+            <w:tcW w:w="1600" w:type="dxa"/>
+            <w:tcBorders>
+              <w:top w:val="single" w:sz="4" w:space="0" w:color="A6A6A6"/>
+              <w:left w:val="single" w:sz="4" w:space="0" w:color="A6A6A6"/>
+              <w:bottom w:val="single" w:sz="4" w:space="0" w:color="A6A6A6"/>
+              <w:right w:val="single" w:sz="4" w:space="0" w:color="A6A6A6"/>
+            </w:tcBorders>
+            <w:tcMar>
+              <w:top w:w="60" w:type="dxa"/>
+              <w:left w:w="90" w:type="dxa"/>
+              <w:bottom w:w="60" w:type="dxa"/>
+              <w:right w:w="90" w:type="dxa"/>
+            </w:tcMar>
+            <w:vAlign w:val="center"/>
+          </w:tcPr>
+          <w:p>
+            <w:pPr>
+              <w:spacing w:after="30"/>
+              <w:jc w:val="left"/>
+            </w:pPr>
+            <w:r>
+              <w:rPr>
+                <w:sz w:val="20"/>
+              </w:rPr>
+              <w:t>44% [34, 54]</w:t>
+            </w:r>
+          </w:p>
+        </w:tc>
+        <w:tc>
+          <w:tcPr>
+            <w:tcW w:w="2626" w:type="dxa"/>
+            <w:tcBorders>
+              <w:top w:val="single" w:sz="4" w:space="0" w:color="A6A6A6"/>
+              <w:left w:val="single" w:sz="4" w:space="0" w:color="A6A6A6"/>
+              <w:bottom w:val="single" w:sz="4" w:space="0" w:color="A6A6A6"/>
+              <w:right w:val="single" w:sz="4" w:space="0" w:color="A6A6A6"/>
+            </w:tcBorders>
+            <w:tcMar>
+              <w:top w:w="60" w:type="dxa"/>
+              <w:left w:w="90" w:type="dxa"/>
+              <w:bottom w:w="60" w:type="dxa"/>
+              <w:right w:w="90" w:type="dxa"/>
+            </w:tcMar>
+            <w:vAlign w:val="center"/>
+          </w:tcPr>
+          <w:p>
+            <w:pPr>
+              <w:spacing w:after="30"/>
+              <w:jc w:val="left"/>
+            </w:pPr>
+            <w:r>
+              <w:rPr>
+                <w:sz w:val="20"/>
+              </w:rPr>
+              <w:t>52% / 80% / 99% / 100%</w:t>
+            </w:r>
+          </w:p>
+        </w:tc>
+        <w:tc>
+          <w:tcPr>
+            <w:tcW w:w="1500" w:type="dxa"/>
+            <w:tcBorders>
+              <w:top w:val="single" w:sz="4" w:space="0" w:color="A6A6A6"/>
+              <w:left w:val="single" w:sz="4" w:space="0" w:color="A6A6A6"/>
+              <w:bottom w:val="single" w:sz="4" w:space="0" w:color="A6A6A6"/>
+              <w:right w:val="single" w:sz="4" w:space="0" w:color="A6A6A6"/>
+            </w:tcBorders>
+            <w:tcMar>
+              <w:top w:w="60" w:type="dxa"/>
+              <w:left w:w="90" w:type="dxa"/>
+              <w:bottom w:w="60" w:type="dxa"/>
+              <w:right w:w="90" w:type="dxa"/>
+            </w:tcMar>
+            <w:vAlign w:val="center"/>
+          </w:tcPr>
+          <w:p>
+            <w:pPr>
+              <w:spacing w:after="30"/>
+              <w:jc w:val="left"/>
+            </w:pPr>
+            <w:r>
+              <w:rPr>
+                <w:sz w:val="20"/>
+              </w:rPr>
+              <w:t>100%</w:t>
+            </w:r>
+          </w:p>
+        </w:tc>
+      </w:tr>
+    </w:tbl>
+    <w:p>
+      <w:pPr>
+        <w:spacing w:after="60"/>
+        <w:jc w:val="both"/>
+      </w:pPr>
+    </w:p>
+    <w:p>
+      <w:pPr>
+        <w:spacing w:after="120" w:line="360" w:lineRule="auto"/>
+        <w:jc w:val="both"/>
+      </w:pPr>
+      <w:r>
+        <w:rPr/>
+        <w:t>Time accuracy rose from 83% to 96% and exact match from 52% to 57% (5 items gained, 0 lost; Holm-adjusted p = 0.141) — not significant, because most of these requests also had a wrong medicine or dose. The time rule left exact match unchanged here but raised time accuracy from 93% and made every output schedulable; it also fixes time-only requests where the model dropped the time. Versus the rule-based baseline with the same fix (44%): 25 wins, 12 losses, Holm-adjusted p = 0.141. Languages stayed balanced (χ² p = 0.989).</w:t>
+      </w:r>
+    </w:p>
+    <w:p>
+      <w:pPr>
+        <w:spacing w:after="120" w:line="360" w:lineRule="auto"/>
+        <w:jc w:val="both"/>
+      </w:pPr>
+      <w:r>
+        <w:rPr>
+          <w:b/>
+        </w:rPr>
+        <w:t>Caveat:</w:t>
+      </w:r>
+      <w:r>
+        <w:rPr/>
+        <w:t xml:space="preserve"> the fixes were designed after seeing errors on this test set, so Table 7.4 is optimistic; Sections 7.1–7.3 remain the reported evaluation and a new held-out set is needed. The remaining 43 failures are mostly drug names (medicine 74% correct) and doses (76%; dose hallucination 36%).</w:t>
       </w:r>
     </w:p>
     <w:p>
@@ -25942,7 +26692,7 @@
       </w:pPr>
       <w:r>
         <w:rPr/>
-        <w:t>Our system scored exactly 52% in every language (13 of 25; χ² = 0.0, p = 1.00), although different items failed in different languages (for example, Bengali lost cetirizine to transliteration, Tamil lost Dolo to "TOLO"). The rule-based baseline was less even (Hindi 52%, Tamil 44%, Telugu 36%, Bengali 36%), because translations into English vary in phrasing and the rules depend on exact wording. With 25 items per language the intervals are wide (about ±20 points), so small differences cannot be ruled out. Not tested: accents, regional dialects, code-mixed speech, gender and age of the speaker, and users with speech or hearing impairments — all relevant for older adults and left for a user study.</w:t>
+        <w:t>Our system scored 52% in every language (χ² p = 1.00), although different items failed in each; the rule-based baseline was less even (Hindi 52%, Tamil 44%, Telugu 36%, Bengali 36%). With 25 items per language the intervals are about ±20 points. Accents, dialects, code-mixed speech, speaker age and gender, and speech or hearing impairments were not tested and are left for a user study.</w:t>
       </w:r>
     </w:p>
     <w:p>
@@ -26072,7 +26822,7 @@
       </w:pPr>
       <w:r>
         <w:rPr/>
-        <w:t>Future work, in order of expected impact: (1) protect clock times from the IndicTransToolkit pre-processing bug (e.g. replace times with placeholders before translation and restore them after); (2) match medicine names against a list of Indian brand and generic names with fuzzy matching, which the lenient metric suggests could raise medicine accuracy from 74% towards 92%; (3) accept a dose only if a number or unit appears in the source sentence, and use the 1.5B model where memory allows, to remove invented doses; (4) read the parsed reminder back to the user and require explicit confirmation; (5) replace browser speech recognition with a local Indic ASR model [3]; and (6) evaluate with older adults on real speech, with a System Usability Scale and task-completion study, using a larger test set checked by native speakers. Each of these must be evaluated on new test data, since the current set has now been used for analysis.</w:t>
+        <w:t>After the evaluation, the clock-time bug was fixed by padding single-digit hours before translation, which raised time accuracy to 96% and exact match to 57% on the same (already-seen) test set (Section 7.7). Remaining future work, in order of expected impact: (1) match medicine names against a list of Indian brand and generic names with fuzzy matching, which the lenient metric suggests could raise medicine accuracy from 74% towards 92%; (2) accept a dose only if a number or unit appears in the source sentence, and use the 1.5B model where memory allows, to remove invented doses; (3) read the parsed reminder back to the user and require explicit confirmation; (4) replace browser speech recognition with a local Indic ASR model [3]; and (5) evaluate with older adults on real speech, with a System Usability Scale and task-completion study, using a larger test set checked by native speakers. Each of these must be evaluated on new test data, since the current set has now been used for analysis.</w:t>
       </w:r>
     </w:p>
     <w:p>
@@ -28089,7 +28839,7 @@
               <w:rPr>
                 <w:sz w:val="18"/>
               </w:rPr>
-              <w:t>Debugging; code for validation, pipeline error handling, Qwen chat prompt and ETA, language slider, reminder cards, Mac notifications; evaluation script, test sentences and translations; literature search; drafting this report</w:t>
+              <w:t>Debugging; code for validation, error handling, Qwen prompt and ETA, language slider, reminder cards, notifications, MongoDB-driven scheduler and time fix; evaluation script, test set and translations; literature search; drafting this report</w:t>
             </w:r>
           </w:p>
         </w:tc>
@@ -28118,7 +28868,7 @@
               <w:rPr>
                 <w:sz w:val="18"/>
               </w:rPr>
-              <w:t>backend/models/Qwen.py, indicTrans2.py; backend/services/pipeline.py, validation.py, scheduler.py; backend/main.py; frontend/src/App.jsx, styles.css; evaluation/*; README.md; all report sections</w:t>
+              <w:t>backend/ (main.py, models/, services/); frontend/src/; evaluation/; README.md; all report sections</w:t>
             </w:r>
           </w:p>
         </w:tc>
@@ -28176,7 +28926,7 @@
               <w:rPr>
                 <w:sz w:val="18"/>
               </w:rPr>
-              <w:t xml:space="preserve">Code run and tested (unit checks, browser checks, evaluation runs); every reference opened on its source page; report numbers produced by evaluation/run_eval.py. </w:t>
+              <w:t xml:space="preserve">Code run and tested (unit checks, browser checks, evaluation runs); references opened at source; numbers from evaluation scripts. </w:t>
             </w:r>
             <w:r>
               <w:rPr>
@@ -28189,7 +28939,7 @@
               <w:rPr>
                 <w:sz w:val="18"/>
               </w:rPr>
-              <w:t>: author to review all text and have native speakers check the test-set translations</w:t>
+              <w:t>: author to review all text; native speakers to check test-set translations</w:t>
             </w:r>
           </w:p>
         </w:tc>

</xml_diff>